<commit_message>
Correct lender entity name to SVLA Holdings, LLC
Co-Authored-By: Claude Fable 5 <noreply@anthropic.com>
Claude-Session: https://claude.ai/code/session_01TMZ3Gfz8TSedYWav6CaRvZ
</commit_message>
<xml_diff>
--- a/Executive/CFO/Legal/SVLA-Holdings-Loan-Agreement-Blinstrub-2026-07-21.docx
+++ b/Executive/CFO/Legal/SVLA-Holdings-Loan-Agreement-Blinstrub-2026-07-21.docx
@@ -110,7 +110,7 @@
           <w:sz w:val="22"/>
           <w:szCs w:val="22"/>
         </w:rPr>
-        <w:t xml:space="preserve">SVLA HOLDINGS INC.</w:t>
+        <w:t xml:space="preserve">SVLA HOLDINGS, LLC</w:t>
       </w:r>
       <w:r>
         <w:rPr>
@@ -2714,7 +2714,7 @@
           <w:sz w:val="22"/>
           <w:szCs w:val="22"/>
         </w:rPr>
-        <w:t xml:space="preserve">SVLA HOLDINGS INC., a California limited liability company</w:t>
+        <w:t xml:space="preserve">SVLA HOLDINGS, LLC, a California limited liability company</w:t>
       </w:r>
     </w:p>
     <w:p>

</xml_diff>

<commit_message>
Restructure loan: DDS Inc. entity as borrower with personal guaranty from Blinstrub
Borrower is now Jonathan R. Blinstrub, DDS Inc. with disbursement to its
business checking account; Jonathan Blinstrub signs individually as
guarantor with a secured continuing guaranty. Adds payment methods
clause (check, transfer, Zelle, ACH to lender-designated account).

Co-Authored-By: Claude Fable 5 <noreply@anthropic.com>
Claude-Session: https://claude.ai/code/session_01TMZ3Gfz8TSedYWav6CaRvZ
</commit_message>
<xml_diff>
--- a/Executive/CFO/Legal/SVLA-Holdings-Loan-Agreement-Blinstrub-2026-07-21.docx
+++ b/Executive/CFO/Legal/SVLA-Holdings-Loan-Agreement-Blinstrub-2026-07-21.docx
@@ -31,7 +31,7 @@
           <w:sz w:val="22"/>
           <w:szCs w:val="22"/>
         </w:rPr>
-        <w:t xml:space="preserve">(Secured Installment Loan — Full Recourse)</w:t>
+        <w:t xml:space="preserve">(Secured Installment Business Loan with Continuing Personal Guaranty)</w:t>
       </w:r>
     </w:p>
     <w:p>
@@ -94,7 +94,7 @@
           <w:sz w:val="22"/>
           <w:szCs w:val="22"/>
         </w:rPr>
-        <w:t xml:space="preserve">), by and between:</w:t>
+        <w:t xml:space="preserve">), by and among:</w:t>
       </w:r>
     </w:p>
     <w:p>
@@ -136,6 +136,48 @@
           <w:sz w:val="22"/>
           <w:szCs w:val="22"/>
         </w:rPr>
+        <w:t xml:space="preserve">);</w:t>
+      </w:r>
+    </w:p>
+    <w:p>
+      <w:pPr>
+        <w:spacing w:after="160" w:line="276"/>
+        <w:jc w:val="both"/>
+      </w:pPr>
+      <w:r>
+        <w:rPr>
+          <w:rFonts w:ascii="Times New Roman" w:cs="Times New Roman" w:eastAsia="Times New Roman" w:hAnsi="Times New Roman"/>
+          <w:b/>
+          <w:bCs/>
+          <w:sz w:val="22"/>
+          <w:szCs w:val="22"/>
+        </w:rPr>
+        <w:t xml:space="preserve">JONATHAN R. BLINSTRUB, DDS INC.</w:t>
+      </w:r>
+      <w:r>
+        <w:rPr>
+          <w:rFonts w:ascii="Times New Roman" w:cs="Times New Roman" w:eastAsia="Times New Roman" w:hAnsi="Times New Roman"/>
+          <w:sz w:val="22"/>
+          <w:szCs w:val="22"/>
+        </w:rPr>
+        <w:t xml:space="preserve">, a California professional corporation, with its principal place of business at 16403 Ventura Blvd, Unit B, Encino, California 91436 (the </w:t>
+      </w:r>
+      <w:r>
+        <w:rPr>
+          <w:rFonts w:ascii="Times New Roman" w:cs="Times New Roman" w:eastAsia="Times New Roman" w:hAnsi="Times New Roman"/>
+          <w:b/>
+          <w:bCs/>
+          <w:sz w:val="22"/>
+          <w:szCs w:val="22"/>
+        </w:rPr>
+        <w:t xml:space="preserve">“Borrower”</w:t>
+      </w:r>
+      <w:r>
+        <w:rPr>
+          <w:rFonts w:ascii="Times New Roman" w:cs="Times New Roman" w:eastAsia="Times New Roman" w:hAnsi="Times New Roman"/>
+          <w:sz w:val="22"/>
+          <w:szCs w:val="22"/>
+        </w:rPr>
         <w:t xml:space="preserve">); and</w:t>
       </w:r>
     </w:p>
@@ -170,15 +212,51 @@
           <w:sz w:val="22"/>
           <w:szCs w:val="22"/>
         </w:rPr>
-        <w:t xml:space="preserve">“Borrower”</w:t>
-      </w:r>
-      <w:r>
-        <w:rPr>
-          <w:rFonts w:ascii="Times New Roman" w:cs="Times New Roman" w:eastAsia="Times New Roman" w:hAnsi="Times New Roman"/>
-          <w:sz w:val="22"/>
-          <w:szCs w:val="22"/>
-        </w:rPr>
-        <w:t xml:space="preserve">). Lender and Borrower are each referred to herein as a </w:t>
+        <w:t xml:space="preserve">“Guarantor”</w:t>
+      </w:r>
+      <w:r>
+        <w:rPr>
+          <w:rFonts w:ascii="Times New Roman" w:cs="Times New Roman" w:eastAsia="Times New Roman" w:hAnsi="Times New Roman"/>
+          <w:sz w:val="22"/>
+          <w:szCs w:val="22"/>
+        </w:rPr>
+        <w:t xml:space="preserve">). Borrower and Guarantor are each sometimes referred to herein as an </w:t>
+      </w:r>
+      <w:r>
+        <w:rPr>
+          <w:rFonts w:ascii="Times New Roman" w:cs="Times New Roman" w:eastAsia="Times New Roman" w:hAnsi="Times New Roman"/>
+          <w:b/>
+          <w:bCs/>
+          <w:sz w:val="22"/>
+          <w:szCs w:val="22"/>
+        </w:rPr>
+        <w:t xml:space="preserve">“Obligor”</w:t>
+      </w:r>
+      <w:r>
+        <w:rPr>
+          <w:rFonts w:ascii="Times New Roman" w:cs="Times New Roman" w:eastAsia="Times New Roman" w:hAnsi="Times New Roman"/>
+          <w:sz w:val="22"/>
+          <w:szCs w:val="22"/>
+        </w:rPr>
+        <w:t xml:space="preserve"> and collectively as the </w:t>
+      </w:r>
+      <w:r>
+        <w:rPr>
+          <w:rFonts w:ascii="Times New Roman" w:cs="Times New Roman" w:eastAsia="Times New Roman" w:hAnsi="Times New Roman"/>
+          <w:b/>
+          <w:bCs/>
+          <w:sz w:val="22"/>
+          <w:szCs w:val="22"/>
+        </w:rPr>
+        <w:t xml:space="preserve">“Obligors”</w:t>
+      </w:r>
+      <w:r>
+        <w:rPr>
+          <w:rFonts w:ascii="Times New Roman" w:cs="Times New Roman" w:eastAsia="Times New Roman" w:hAnsi="Times New Roman"/>
+          <w:sz w:val="22"/>
+          <w:szCs w:val="22"/>
+        </w:rPr>
+        <w:t xml:space="preserve">; Lender, Borrower, and Guarantor are each referred to herein as a </w:t>
       </w:r>
       <w:r>
         <w:rPr>
@@ -236,35 +314,49 @@
           <w:sz w:val="22"/>
           <w:szCs w:val="22"/>
         </w:rPr>
-        <w:t xml:space="preserve">A.	Borrower has requested that Lender extend a loan to Borrower in the original principal amount of Forty Thousand and 00/100 Dollars ($40,000.00);</w:t>
-      </w:r>
-    </w:p>
-    <w:p>
-      <w:pPr>
-        <w:spacing w:after="160" w:line="276"/>
-        <w:jc w:val="both"/>
-      </w:pPr>
-      <w:r>
-        <w:rPr>
-          <w:rFonts w:ascii="Times New Roman" w:cs="Times New Roman" w:eastAsia="Times New Roman" w:hAnsi="Times New Roman"/>
-          <w:sz w:val="22"/>
-          <w:szCs w:val="22"/>
-        </w:rPr>
-        <w:t xml:space="preserve">B.	Lender is willing to make such loan to Borrower solely upon the terms and conditions set forth in this Agreement, including, without limitation, Borrower's grant of a continuing security interest in the Collateral (as defined below) and Borrower's absolute, unconditional, and irrevocable personal guaranty of, and full-recourse personal liability for, all Obligations (as defined below); and</w:t>
-      </w:r>
-    </w:p>
-    <w:p>
-      <w:pPr>
-        <w:spacing w:after="160" w:line="276"/>
-        <w:jc w:val="both"/>
-      </w:pPr>
-      <w:r>
-        <w:rPr>
-          <w:rFonts w:ascii="Times New Roman" w:cs="Times New Roman" w:eastAsia="Times New Roman" w:hAnsi="Times New Roman"/>
-          <w:sz w:val="22"/>
-          <w:szCs w:val="22"/>
-        </w:rPr>
-        <w:t xml:space="preserve">C.	Borrower acknowledges that Lender is relying upon each representation, warranty, covenant, and agreement of Borrower contained herein in making the Loan.</w:t>
+        <w:t xml:space="preserve">A.	Borrower has requested that Lender extend a loan to Borrower, for Borrower's business purposes, in the original principal amount of Forty Thousand and 00/100 Dollars ($40,000.00);</w:t>
+      </w:r>
+    </w:p>
+    <w:p>
+      <w:pPr>
+        <w:spacing w:after="160" w:line="276"/>
+        <w:jc w:val="both"/>
+      </w:pPr>
+      <w:r>
+        <w:rPr>
+          <w:rFonts w:ascii="Times New Roman" w:cs="Times New Roman" w:eastAsia="Times New Roman" w:hAnsi="Times New Roman"/>
+          <w:sz w:val="22"/>
+          <w:szCs w:val="22"/>
+        </w:rPr>
+        <w:t xml:space="preserve">B.	Guarantor is the principal, owner, and operator of Borrower, will derive direct and substantial financial benefit from the loan, and, as a material inducement to Lender to make the loan, has agreed to absolutely, unconditionally, and irrevocably guarantee all obligations of Borrower hereunder and to secure such guaranty with Guarantor's personal assets as provided herein;</w:t>
+      </w:r>
+    </w:p>
+    <w:p>
+      <w:pPr>
+        <w:spacing w:after="160" w:line="276"/>
+        <w:jc w:val="both"/>
+      </w:pPr>
+      <w:r>
+        <w:rPr>
+          <w:rFonts w:ascii="Times New Roman" w:cs="Times New Roman" w:eastAsia="Times New Roman" w:hAnsi="Times New Roman"/>
+          <w:sz w:val="22"/>
+          <w:szCs w:val="22"/>
+        </w:rPr>
+        <w:t xml:space="preserve">C.	Lender is willing to make such loan solely upon the terms and conditions set forth in this Agreement, including, without limitation, each Obligor's grant of a continuing security interest in its, his, or her Collateral (as defined below) and Guarantor's continuing personal guaranty; and</w:t>
+      </w:r>
+    </w:p>
+    <w:p>
+      <w:pPr>
+        <w:spacing w:after="160" w:line="276"/>
+        <w:jc w:val="both"/>
+      </w:pPr>
+      <w:r>
+        <w:rPr>
+          <w:rFonts w:ascii="Times New Roman" w:cs="Times New Roman" w:eastAsia="Times New Roman" w:hAnsi="Times New Roman"/>
+          <w:sz w:val="22"/>
+          <w:szCs w:val="22"/>
+        </w:rPr>
+        <w:t xml:space="preserve">D.	Each Obligor acknowledges that Lender is relying upon each representation, warranty, covenant, and agreement of the Obligors contained herein in making the loan.</w:t>
       </w:r>
     </w:p>
     <w:p>
@@ -367,7 +459,7 @@
           <w:sz w:val="22"/>
           <w:szCs w:val="22"/>
         </w:rPr>
-        <w:t xml:space="preserve">).</w:t>
+        <w:t xml:space="preserve">). The Loan is made for business and commercial purposes of Borrower only, and no portion of the Loan proceeds shall be used for personal, family, or household purposes.</w:t>
       </w:r>
     </w:p>
     <w:p>
@@ -402,25 +494,25 @@
           <w:sz w:val="22"/>
           <w:szCs w:val="22"/>
         </w:rPr>
-        <w:t xml:space="preserve">Lender shall disburse the Loan proceeds in a single advance on or promptly after the Effective Date by wire transfer or ACH to Borrower's deposit account at JPMorgan Chase Bank, N.A. (Chase), as follows: </w:t>
-      </w:r>
-      <w:r>
-        <w:rPr>
-          <w:rFonts w:ascii="Times New Roman" w:cs="Times New Roman" w:eastAsia="Times New Roman" w:hAnsi="Times New Roman"/>
-          <w:b/>
-          <w:bCs/>
-          <w:sz w:val="22"/>
-          <w:szCs w:val="22"/>
-        </w:rPr>
-        <w:t xml:space="preserve">Account No. 1851709825; Routing No. 322271627</w:t>
-      </w:r>
-      <w:r>
-        <w:rPr>
-          <w:rFonts w:ascii="Times New Roman" w:cs="Times New Roman" w:eastAsia="Times New Roman" w:hAnsi="Times New Roman"/>
-          <w:sz w:val="22"/>
-          <w:szCs w:val="22"/>
-        </w:rPr>
-        <w:t xml:space="preserve">; branch address: 16403 Ventura Blvd, Unit B, Encino, CA 91436, United States. Borrower represents and warrants that such account is owned and controlled solely by Borrower, and disbursement to such account shall conclusively constitute full advance of the Loan.</w:t>
+        <w:t xml:space="preserve">Lender shall disburse the Loan proceeds in a single advance on or promptly after the Effective Date by wire transfer or ACH to Borrower's business checking account at JPMorgan Chase Bank, N.A. (Chase), held in the name of Jonathan R. Blinstrub, DDS Inc., as follows: </w:t>
+      </w:r>
+      <w:r>
+        <w:rPr>
+          <w:rFonts w:ascii="Times New Roman" w:cs="Times New Roman" w:eastAsia="Times New Roman" w:hAnsi="Times New Roman"/>
+          <w:b/>
+          <w:bCs/>
+          <w:sz w:val="22"/>
+          <w:szCs w:val="22"/>
+        </w:rPr>
+        <w:t xml:space="preserve">Account No. 952717390; Routing No. 322271627</w:t>
+      </w:r>
+      <w:r>
+        <w:rPr>
+          <w:rFonts w:ascii="Times New Roman" w:cs="Times New Roman" w:eastAsia="Times New Roman" w:hAnsi="Times New Roman"/>
+          <w:sz w:val="22"/>
+          <w:szCs w:val="22"/>
+        </w:rPr>
+        <w:t xml:space="preserve">. Borrower represents and warrants that such account is owned and controlled solely by Borrower, and disbursement to such account shall conclusively constitute full advance of the Loan.</w:t>
       </w:r>
     </w:p>
     <w:p>
@@ -739,7 +831,7 @@
           <w:sz w:val="22"/>
           <w:szCs w:val="22"/>
         </w:rPr>
-        <w:t xml:space="preserve">All payments shall be made in immediately available funds to such account or address as Lender may designate in writing from time to time. A payment is deemed made only upon Lender's actual receipt of good funds. If any payment is subsequently rescinded, avoided, or required to be returned (including in any bankruptcy or insolvency proceeding), the Obligations shall be reinstated as though such payment had not been made.</w:t>
+        <w:t xml:space="preserve">All payments shall be made in immediately available funds by any of the following methods, at Borrower's election: (a) check payable to Lender; (b) bank or wire transfer; (c) Zelle; or (d) ACH transfer, in each case delivered or transmitted to such account, address, or payment identifier as Lender may designate in writing from time to time. Lender may confirm, change, or supplement its designated account, address, or payment identifier, and the permitted payment methods, at any time by written notice to Borrower, and Borrower shall make all subsequent payments in accordance with the most recent designation. A payment is deemed made only upon Lender's actual receipt of good funds (and, in the case of a check, upon final clearance). If any payment is subsequently rescinded, avoided, dishonored, or required to be returned (including in any bankruptcy or insolvency proceeding), the Obligations shall be reinstated as though such payment had not been made.</w:t>
       </w:r>
     </w:p>
     <w:p>
@@ -1039,7 +1131,7 @@
           <w:sz w:val="22"/>
           <w:szCs w:val="22"/>
         </w:rPr>
-        <w:t xml:space="preserve">As security for the full and punctual payment and performance of all Obligations, Borrower hereby grants, pledges, and assigns to Lender a continuing first-priority security interest in and lien upon all of Borrower's right, title, and interest in and to all assets and personal property of Borrower, whether now owned as of the Effective Date or hereafter acquired, wherever located, in each case having an individual fair market value of </w:t>
+        <w:t xml:space="preserve">As security for the full and punctual payment and performance of all Obligations (including, in the case of Guarantor, the Guaranteed Obligations described in Article 5), each Obligor hereby grants, pledges, and assigns to Lender a continuing first-priority security interest in and lien upon all of such Obligor's right, title, and interest in and to all assets and personal property of such Obligor, whether now owned as of the Effective Date or hereafter acquired, wherever located, in each case having an individual fair market value of </w:t>
       </w:r>
       <w:r>
         <w:rPr>
@@ -1057,7 +1149,7 @@
           <w:sz w:val="22"/>
           <w:szCs w:val="22"/>
         </w:rPr>
-        <w:t xml:space="preserve">, including, without limitation, all: (a) goods, equipment, furniture, fixtures, and vehicles; (b) inventory; (c) accounts, payment intangibles, and rights to payment; (d) deposit accounts, securities accounts, investment property, and financial assets; (e) instruments, chattel paper, and documents; (f) general intangibles, including intellectual property, business interests, membership and partnership interests, and contract rights; (g) commercial tort claims; (h) money and cash equivalents; and (i) all products, proceeds, accessions, substitutions, and replacements of any of the foregoing (collectively, the </w:t>
+        <w:t xml:space="preserve">, including, without limitation, all: (a) goods, equipment, furniture, fixtures, dental and medical equipment, and vehicles; (b) inventory and supplies; (c) accounts, accounts receivable, payment intangibles, health-care-insurance receivables, and rights to payment; (d) deposit accounts, securities accounts, investment property, and financial assets; (e) instruments, chattel paper, and documents; (f) general intangibles, including intellectual property, goodwill, business interests, shares, membership and partnership interests, and contract rights; (g) commercial tort claims; (h) money and cash equivalents; and (i) all products, proceeds, accessions, substitutions, and replacements of any of the foregoing (collectively, with respect to each Obligor, such Obligor's </w:t>
       </w:r>
       <w:r>
         <w:rPr>
@@ -1110,7 +1202,7 @@
           <w:sz w:val="22"/>
           <w:szCs w:val="22"/>
         </w:rPr>
-        <w:t xml:space="preserve">Borrower shall not sell, assign, transfer, convey, lease, license, exchange, gift, pledge, hypothecate, or otherwise dispose of or encumber any Collateral, or permit any lien, levy, or security interest (other than Lender's) to attach to any Collateral, </w:t>
+        <w:t xml:space="preserve">No Obligor shall sell, assign, transfer, convey, lease, license, exchange, gift, pledge, hypothecate, or otherwise dispose of or encumber any Collateral, or permit any lien, levy, or security interest (other than Lender's) to attach to any Collateral, </w:t>
       </w:r>
       <w:r>
         <w:rPr>
@@ -1128,7 +1220,7 @@
           <w:sz w:val="22"/>
           <w:szCs w:val="22"/>
         </w:rPr>
-        <w:t xml:space="preserve">, which approval Lender may grant, condition, or withhold in its sole and absolute discretion. Any purported transfer or encumbrance in violation of this Section 4.2 shall be void as between the Parties, shall constitute an immediate Event of Default without notice or cure period, and Lender's security interest shall continue in the Collateral and in all proceeds thereof.</w:t>
+        <w:t xml:space="preserve">, which approval Lender may grant, condition, or withhold in its sole and absolute discretion; provided that Borrower may use inventory and supplies, and collect its accounts receivable, in the ordinary course of its dental practice. Any purported transfer or encumbrance in violation of this Section 4.2 shall be void as between the Parties, shall constitute an immediate Event of Default without notice or cure period, and Lender's security interest shall continue in the Collateral and in all proceeds thereof.</w:t>
       </w:r>
     </w:p>
     <w:p>
@@ -1163,7 +1255,7 @@
           <w:sz w:val="22"/>
           <w:szCs w:val="22"/>
         </w:rPr>
-        <w:t xml:space="preserve">Borrower authorizes Lender, at any time and from time to time, to file in any jurisdiction one or more UCC-1 financing statements (and amendments and continuations thereof) describing the Collateral, including with an “all assets” or “all personal property” description to the extent describing the Collateral, without Borrower's signature. Borrower shall execute and deliver such further instruments, certificates of title notations, control agreements, and other documents, and take such further actions, as Lender may reasonably request to create, perfect, maintain, and protect Lender's security interest.</w:t>
+        <w:t xml:space="preserve">Each Obligor authorizes Lender, at any time and from time to time, to file in any jurisdiction one or more UCC-1 financing statements (and amendments and continuations thereof) against such Obligor describing such Obligor's Collateral, including with an “all assets” or “all personal property” description to the extent describing the Collateral, without such Obligor's signature. Each Obligor shall execute and deliver such further instruments, certificates of title notations, control agreements, and other documents, and take such further actions, as Lender may reasonably request to create, perfect, maintain, and protect Lender's security interest.</w:t>
       </w:r>
     </w:p>
     <w:p>
@@ -1198,7 +1290,7 @@
           <w:sz w:val="22"/>
           <w:szCs w:val="22"/>
         </w:rPr>
-        <w:t xml:space="preserve">Borrower shall, at Borrower's expense: (a) maintain the Collateral in good condition and repair, ordinary wear and tear excepted; (b) keep the Collateral free of all liens and claims other than Lender's security interest; (c) maintain customary insurance on insurable Collateral and, upon Lender's request, name Lender as lender loss payee; (d) pay when due all taxes and assessments on the Collateral; and (e) promptly notify Lender in writing of any loss, theft, damage, levy, seizure, or material decline in value of any Collateral.</w:t>
+        <w:t xml:space="preserve">Each Obligor shall, at such Obligor's expense: (a) maintain such Obligor's Collateral in good condition and repair, ordinary wear and tear excepted; (b) keep such Collateral free of all liens and claims other than Lender's security interest; (c) maintain customary insurance on insurable Collateral and, upon Lender's request, name Lender as lender loss payee; (d) pay when due all taxes and assessments on such Collateral; and (e) promptly notify Lender in writing of any loss, theft, damage, levy, seizure, or material decline in value of any Collateral.</w:t>
       </w:r>
     </w:p>
     <w:p>
@@ -1233,7 +1325,7 @@
           <w:sz w:val="22"/>
           <w:szCs w:val="22"/>
         </w:rPr>
-        <w:t xml:space="preserve">The security interest granted herein is a continuing security interest, shall survive until all Obligations have been indefeasibly paid and performed in full, and shall not be affected by any renewal, extension, amendment, or modification of the Obligations. Upon indefeasible payment in full of all Obligations, Lender shall, at Borrower's expense, promptly terminate its financing statements and release its security interest.</w:t>
+        <w:t xml:space="preserve">The security interests granted herein are continuing security interests, shall survive until all Obligations have been indefeasibly paid and performed in full, and shall not be affected by any renewal, extension, amendment, or modification of the Obligations. Upon indefeasible payment in full of all Obligations, Lender shall, at Borrower's expense, promptly terminate its financing statements and release its security interests.</w:t>
       </w:r>
     </w:p>
     <w:p>
@@ -1251,7 +1343,7 @@
           <w:sz w:val="22"/>
           <w:szCs w:val="22"/>
         </w:rPr>
-        <w:t xml:space="preserve">5. Personal Guaranty; Full Recourse</w:t>
+        <w:t xml:space="preserve">5. Continuing Personal Guaranty</w:t>
       </w:r>
     </w:p>
     <w:p>
@@ -1278,15 +1370,33 @@
           <w:szCs w:val="22"/>
           <w:u w:val="single"/>
         </w:rPr>
-        <w:t xml:space="preserve">Absolute Personal Obligation. </w:t>
-      </w:r>
-      <w:r>
-        <w:rPr>
-          <w:rFonts w:ascii="Times New Roman" w:cs="Times New Roman" w:eastAsia="Times New Roman" w:hAnsi="Times New Roman"/>
-          <w:sz w:val="22"/>
-          <w:szCs w:val="22"/>
-        </w:rPr>
-        <w:t xml:space="preserve">Borrower's Obligations are full-recourse personal obligations of Borrower. Borrower hereby absolutely, unconditionally, and irrevocably guarantees the full and punctual payment and performance of all Obligations, and agrees that Lender may enforce the Obligations against Borrower personally and against any and all assets and property of Borrower, without first proceeding against, marshaling, or exhausting any Collateral or any other remedy. Borrower's liability hereunder is primary, not secondary.</w:t>
+        <w:t xml:space="preserve">Guaranty. </w:t>
+      </w:r>
+      <w:r>
+        <w:rPr>
+          <w:rFonts w:ascii="Times New Roman" w:cs="Times New Roman" w:eastAsia="Times New Roman" w:hAnsi="Times New Roman"/>
+          <w:sz w:val="22"/>
+          <w:szCs w:val="22"/>
+        </w:rPr>
+        <w:t xml:space="preserve">Guarantor hereby absolutely, unconditionally, and irrevocably guarantees to Lender the full and punctual payment and performance when due (whether at stated maturity, by acceleration, or otherwise) of all Obligations of Borrower under this Agreement, together with all renewals, extensions, and modifications thereof and all costs of enforcement (collectively, the </w:t>
+      </w:r>
+      <w:r>
+        <w:rPr>
+          <w:rFonts w:ascii="Times New Roman" w:cs="Times New Roman" w:eastAsia="Times New Roman" w:hAnsi="Times New Roman"/>
+          <w:b/>
+          <w:bCs/>
+          <w:sz w:val="22"/>
+          <w:szCs w:val="22"/>
+        </w:rPr>
+        <w:t xml:space="preserve">“Guaranteed Obligations”</w:t>
+      </w:r>
+      <w:r>
+        <w:rPr>
+          <w:rFonts w:ascii="Times New Roman" w:cs="Times New Roman" w:eastAsia="Times New Roman" w:hAnsi="Times New Roman"/>
+          <w:sz w:val="22"/>
+          <w:szCs w:val="22"/>
+        </w:rPr>
+        <w:t xml:space="preserve">). This is a continuing guaranty of payment and performance, not of collection, and Guarantor's liability is primary, direct, and immediate, and not conditional or contingent upon Lender's pursuit of any remedy against Borrower or any Collateral. Lender may proceed directly against Guarantor, and against any and all assets and property of Guarantor, without first proceeding against, marshaling, or exhausting Borrower, any Collateral, or any other remedy. Guarantor's obligations hereunder are secured by the security interest granted by Guarantor in Article 4.</w:t>
       </w:r>
     </w:p>
     <w:p>
@@ -1321,7 +1431,7 @@
           <w:sz w:val="22"/>
           <w:szCs w:val="22"/>
         </w:rPr>
-        <w:t xml:space="preserve">To the fullest extent permitted by law, Borrower waives: presentment; demand for payment; notice of dishonor; protest and notice of protest; notice of acceptance; diligence in collection; any requirement that Lender exhaust any right or remedy or proceed against any Collateral before proceeding against Borrower personally; and all suretyship and guarantor defenses, including, without limitation, those arising under California Civil Code Sections 2787 through 2855, inclusive, and Sections 2899 and 3433, to the extent applicable.</w:t>
+        <w:t xml:space="preserve">To the fullest extent permitted by law, Guarantor waives: presentment; demand for payment; notice of dishonor; protest and notice of protest; notice of acceptance of this guaranty; notice of any advances, defaults, or modifications; diligence in collection; any requirement that Lender exhaust any right or remedy or proceed against Borrower or any Collateral before proceeding against Guarantor; any defense based on Borrower's incapacity, dissolution, bankruptcy, or discharge; and all suretyship and guarantor defenses, including, without limitation, those arising under California Civil Code Sections 2787 through 2855, inclusive, and Sections 2899 and 3433. Until the Obligations are indefeasibly paid in full, Guarantor waives all rights of subrogation, reimbursement, indemnification, and contribution against Borrower, and any right to enforce any remedy Lender now has or may hereafter have against Borrower.</w:t>
       </w:r>
     </w:p>
     <w:p>
@@ -1356,7 +1466,42 @@
           <w:sz w:val="22"/>
           <w:szCs w:val="22"/>
         </w:rPr>
-        <w:t xml:space="preserve">Borrower's liability shall not be discharged, diminished, or otherwise affected by: (a) any extension, renewal, forbearance, or modification of the Obligations; (b) any release, substitution, impairment, or non-perfection of any Collateral; (c) any invalidity or unenforceability of any provision of this Agreement; or (d) any other circumstance that might otherwise constitute a legal or equitable discharge of a borrower, guarantor, or surety.</w:t>
+        <w:t xml:space="preserve">Guarantor's liability shall not be discharged, diminished, or otherwise affected by: (a) any extension, renewal, forbearance, or modification of the Obligations; (b) any release, substitution, impairment, or non-perfection of any Collateral or any other security or guaranty; (c) any invalidity or unenforceability of any provision of this Agreement or of the Obligations as against Borrower; (d) any change in the ownership, structure, or existence of Borrower; or (e) any other circumstance that might otherwise constitute a legal or equitable discharge of a guarantor or surety. Guarantor may not revoke this guaranty while any Obligations remain outstanding, and any attempted revocation shall constitute an immediate Event of Default.</w:t>
+      </w:r>
+    </w:p>
+    <w:p>
+      <w:pPr>
+        <w:spacing w:after="160" w:line="276"/>
+        <w:jc w:val="both"/>
+      </w:pPr>
+      <w:r>
+        <w:rPr>
+          <w:rFonts w:ascii="Times New Roman" w:cs="Times New Roman" w:eastAsia="Times New Roman" w:hAnsi="Times New Roman"/>
+          <w:b/>
+          <w:bCs/>
+          <w:sz w:val="22"/>
+          <w:szCs w:val="22"/>
+        </w:rPr>
+        <w:t xml:space="preserve">5.4 </w:t>
+      </w:r>
+      <w:r>
+        <w:rPr>
+          <w:rFonts w:ascii="Times New Roman" w:cs="Times New Roman" w:eastAsia="Times New Roman" w:hAnsi="Times New Roman"/>
+          <w:b/>
+          <w:bCs/>
+          <w:sz w:val="22"/>
+          <w:szCs w:val="22"/>
+          <w:u w:val="single"/>
+        </w:rPr>
+        <w:t xml:space="preserve">Financial Benefit; Independent Obligation. </w:t>
+      </w:r>
+      <w:r>
+        <w:rPr>
+          <w:rFonts w:ascii="Times New Roman" w:cs="Times New Roman" w:eastAsia="Times New Roman" w:hAnsi="Times New Roman"/>
+          <w:sz w:val="22"/>
+          <w:szCs w:val="22"/>
+        </w:rPr>
+        <w:t xml:space="preserve">Guarantor represents that Guarantor is the principal and owner of Borrower, will receive direct and substantial financial benefit from the Loan, and has determined that executing this Agreement is in Guarantor's interest. Guarantor's obligations are independent of Borrower's, and a separate action may be brought against Guarantor whether or not an action is brought against Borrower and whether or not Borrower is joined in any such action.</w:t>
       </w:r>
     </w:p>
     <w:p>
@@ -1374,14 +1519,35 @@
           <w:sz w:val="22"/>
           <w:szCs w:val="22"/>
         </w:rPr>
-        <w:t xml:space="preserve">6. Representations and Warranties of Borrower</w:t>
-      </w:r>
-    </w:p>
-    <w:p>
-      <w:pPr>
-        <w:spacing w:after="160" w:line="276"/>
-        <w:jc w:val="both"/>
-      </w:pPr>
+        <w:t xml:space="preserve">6. Representations and Warranties</w:t>
+      </w:r>
+    </w:p>
+    <w:p>
+      <w:pPr>
+        <w:spacing w:after="160" w:line="276"/>
+        <w:jc w:val="both"/>
+      </w:pPr>
+      <w:r>
+        <w:rPr>
+          <w:rFonts w:ascii="Times New Roman" w:cs="Times New Roman" w:eastAsia="Times New Roman" w:hAnsi="Times New Roman"/>
+          <w:b/>
+          <w:bCs/>
+          <w:sz w:val="22"/>
+          <w:szCs w:val="22"/>
+        </w:rPr>
+        <w:t xml:space="preserve">6.1 </w:t>
+      </w:r>
+      <w:r>
+        <w:rPr>
+          <w:rFonts w:ascii="Times New Roman" w:cs="Times New Roman" w:eastAsia="Times New Roman" w:hAnsi="Times New Roman"/>
+          <w:b/>
+          <w:bCs/>
+          <w:sz w:val="22"/>
+          <w:szCs w:val="22"/>
+          <w:u w:val="single"/>
+        </w:rPr>
+        <w:t xml:space="preserve">Borrower Representations. </w:t>
+      </w:r>
       <w:r>
         <w:rPr>
           <w:rFonts w:ascii="Times New Roman" w:cs="Times New Roman" w:eastAsia="Times New Roman" w:hAnsi="Times New Roman"/>
@@ -1411,7 +1577,7 @@
           <w:sz w:val="22"/>
           <w:szCs w:val="22"/>
         </w:rPr>
-        <w:t xml:space="preserve">Borrower is an individual of legal age and sound mind, with full legal capacity, power, and authority to execute, deliver, and perform this Agreement, and this Agreement constitutes Borrower's legal, valid, and binding obligation, enforceable in accordance with its terms;</w:t>
+        <w:t xml:space="preserve">Borrower is a professional corporation duly organized, validly existing, and in good standing under the laws of the State of California, with full corporate power and authority to own its assets, conduct its business, and execute, deliver, and perform this Agreement;</w:t>
       </w:r>
     </w:p>
     <w:p>
@@ -1434,7 +1600,7 @@
           <w:sz w:val="22"/>
           <w:szCs w:val="22"/>
         </w:rPr>
-        <w:t xml:space="preserve">the execution, delivery, and performance of this Agreement do not and will not violate any law, judgment, order, or agreement binding upon Borrower or Borrower's assets;</w:t>
+        <w:t xml:space="preserve">the execution, delivery, and performance of this Agreement have been duly authorized by all necessary corporate action, and this Agreement constitutes Borrower's legal, valid, and binding obligation, enforceable in accordance with its terms;</w:t>
       </w:r>
     </w:p>
     <w:p>
@@ -1457,7 +1623,7 @@
           <w:sz w:val="22"/>
           <w:szCs w:val="22"/>
         </w:rPr>
-        <w:t xml:space="preserve">Borrower is the sole legal and beneficial owner of the Collateral, free and clear of all liens, security interests, and encumbrances other than the security interest granted to Lender herein;</w:t>
+        <w:t xml:space="preserve">the execution, delivery, and performance of this Agreement do not and will not violate Borrower's articles of incorporation or bylaws, or any law, judgment, order, or agreement binding upon Borrower or its assets;</w:t>
       </w:r>
     </w:p>
     <w:p>
@@ -1480,6 +1646,29 @@
           <w:sz w:val="22"/>
           <w:szCs w:val="22"/>
         </w:rPr>
+        <w:t xml:space="preserve">Borrower is the sole legal and beneficial owner of its Collateral, free and clear of all liens, security interests, and encumbrances other than the security interest granted to Lender herein;</w:t>
+      </w:r>
+    </w:p>
+    <w:p>
+      <w:pPr>
+        <w:spacing w:after="160" w:line="276"/>
+        <w:ind w:left="720"/>
+        <w:jc w:val="both"/>
+      </w:pPr>
+      <w:r>
+        <w:rPr>
+          <w:rFonts w:ascii="Times New Roman" w:cs="Times New Roman" w:eastAsia="Times New Roman" w:hAnsi="Times New Roman"/>
+          <w:sz w:val="22"/>
+          <w:szCs w:val="22"/>
+        </w:rPr>
+        <w:t xml:space="preserve">(e) </w:t>
+      </w:r>
+      <w:r>
+        <w:rPr>
+          <w:rFonts w:ascii="Times New Roman" w:cs="Times New Roman" w:eastAsia="Times New Roman" w:hAnsi="Times New Roman"/>
+          <w:sz w:val="22"/>
+          <w:szCs w:val="22"/>
+        </w:rPr>
         <w:t xml:space="preserve">Borrower is solvent, is not contemplating any bankruptcy, insolvency, or similar proceeding, and no such proceeding is pending or, to Borrower's knowledge, threatened against Borrower;</w:t>
       </w:r>
     </w:p>
@@ -1495,6 +1684,179 @@
           <w:sz w:val="22"/>
           <w:szCs w:val="22"/>
         </w:rPr>
+        <w:t xml:space="preserve">(f) </w:t>
+      </w:r>
+      <w:r>
+        <w:rPr>
+          <w:rFonts w:ascii="Times New Roman" w:cs="Times New Roman" w:eastAsia="Times New Roman" w:hAnsi="Times New Roman"/>
+          <w:sz w:val="22"/>
+          <w:szCs w:val="22"/>
+        </w:rPr>
+        <w:t xml:space="preserve">the Loan proceeds will be used exclusively for business and commercial purposes of Borrower and not for any personal, family, household, or unlawful purpose; and</w:t>
+      </w:r>
+    </w:p>
+    <w:p>
+      <w:pPr>
+        <w:spacing w:after="160" w:line="276"/>
+        <w:ind w:left="720"/>
+        <w:jc w:val="both"/>
+      </w:pPr>
+      <w:r>
+        <w:rPr>
+          <w:rFonts w:ascii="Times New Roman" w:cs="Times New Roman" w:eastAsia="Times New Roman" w:hAnsi="Times New Roman"/>
+          <w:sz w:val="22"/>
+          <w:szCs w:val="22"/>
+        </w:rPr>
+        <w:t xml:space="preserve">(g) </w:t>
+      </w:r>
+      <w:r>
+        <w:rPr>
+          <w:rFonts w:ascii="Times New Roman" w:cs="Times New Roman" w:eastAsia="Times New Roman" w:hAnsi="Times New Roman"/>
+          <w:sz w:val="22"/>
+          <w:szCs w:val="22"/>
+        </w:rPr>
+        <w:t xml:space="preserve">all information furnished by or on behalf of Borrower to Lender in connection with the Loan (including the bank account information in Section 1.2) is true, complete, and correct in all material respects.</w:t>
+      </w:r>
+    </w:p>
+    <w:p>
+      <w:pPr>
+        <w:spacing w:after="160" w:line="276"/>
+        <w:jc w:val="both"/>
+      </w:pPr>
+      <w:r>
+        <w:rPr>
+          <w:rFonts w:ascii="Times New Roman" w:cs="Times New Roman" w:eastAsia="Times New Roman" w:hAnsi="Times New Roman"/>
+          <w:b/>
+          <w:bCs/>
+          <w:sz w:val="22"/>
+          <w:szCs w:val="22"/>
+        </w:rPr>
+        <w:t xml:space="preserve">6.2 </w:t>
+      </w:r>
+      <w:r>
+        <w:rPr>
+          <w:rFonts w:ascii="Times New Roman" w:cs="Times New Roman" w:eastAsia="Times New Roman" w:hAnsi="Times New Roman"/>
+          <w:b/>
+          <w:bCs/>
+          <w:sz w:val="22"/>
+          <w:szCs w:val="22"/>
+          <w:u w:val="single"/>
+        </w:rPr>
+        <w:t xml:space="preserve">Guarantor Representations. </w:t>
+      </w:r>
+      <w:r>
+        <w:rPr>
+          <w:rFonts w:ascii="Times New Roman" w:cs="Times New Roman" w:eastAsia="Times New Roman" w:hAnsi="Times New Roman"/>
+          <w:sz w:val="22"/>
+          <w:szCs w:val="22"/>
+        </w:rPr>
+        <w:t xml:space="preserve">Guarantor represents and warrants to Lender, as of the Effective Date and as of the date of each payment hereunder, that:</w:t>
+      </w:r>
+    </w:p>
+    <w:p>
+      <w:pPr>
+        <w:spacing w:after="160" w:line="276"/>
+        <w:ind w:left="720"/>
+        <w:jc w:val="both"/>
+      </w:pPr>
+      <w:r>
+        <w:rPr>
+          <w:rFonts w:ascii="Times New Roman" w:cs="Times New Roman" w:eastAsia="Times New Roman" w:hAnsi="Times New Roman"/>
+          <w:sz w:val="22"/>
+          <w:szCs w:val="22"/>
+        </w:rPr>
+        <w:t xml:space="preserve">(a) </w:t>
+      </w:r>
+      <w:r>
+        <w:rPr>
+          <w:rFonts w:ascii="Times New Roman" w:cs="Times New Roman" w:eastAsia="Times New Roman" w:hAnsi="Times New Roman"/>
+          <w:sz w:val="22"/>
+          <w:szCs w:val="22"/>
+        </w:rPr>
+        <w:t xml:space="preserve">Guarantor is an individual of legal age and sound mind, with full legal capacity, power, and authority to execute, deliver, and perform this Agreement, both on Guarantor's own behalf and on behalf of Borrower;</w:t>
+      </w:r>
+    </w:p>
+    <w:p>
+      <w:pPr>
+        <w:spacing w:after="160" w:line="276"/>
+        <w:ind w:left="720"/>
+        <w:jc w:val="both"/>
+      </w:pPr>
+      <w:r>
+        <w:rPr>
+          <w:rFonts w:ascii="Times New Roman" w:cs="Times New Roman" w:eastAsia="Times New Roman" w:hAnsi="Times New Roman"/>
+          <w:sz w:val="22"/>
+          <w:szCs w:val="22"/>
+        </w:rPr>
+        <w:t xml:space="preserve">(b) </w:t>
+      </w:r>
+      <w:r>
+        <w:rPr>
+          <w:rFonts w:ascii="Times New Roman" w:cs="Times New Roman" w:eastAsia="Times New Roman" w:hAnsi="Times New Roman"/>
+          <w:sz w:val="22"/>
+          <w:szCs w:val="22"/>
+        </w:rPr>
+        <w:t xml:space="preserve">Guarantor is the sole legal and beneficial owner of Guarantor's Collateral, free and clear of all liens, security interests, and encumbrances other than the security interest granted to Lender herein;</w:t>
+      </w:r>
+    </w:p>
+    <w:p>
+      <w:pPr>
+        <w:spacing w:after="160" w:line="276"/>
+        <w:ind w:left="720"/>
+        <w:jc w:val="both"/>
+      </w:pPr>
+      <w:r>
+        <w:rPr>
+          <w:rFonts w:ascii="Times New Roman" w:cs="Times New Roman" w:eastAsia="Times New Roman" w:hAnsi="Times New Roman"/>
+          <w:sz w:val="22"/>
+          <w:szCs w:val="22"/>
+        </w:rPr>
+        <w:t xml:space="preserve">(c) </w:t>
+      </w:r>
+      <w:r>
+        <w:rPr>
+          <w:rFonts w:ascii="Times New Roman" w:cs="Times New Roman" w:eastAsia="Times New Roman" w:hAnsi="Times New Roman"/>
+          <w:sz w:val="22"/>
+          <w:szCs w:val="22"/>
+        </w:rPr>
+        <w:t xml:space="preserve">Guarantor is solvent and no bankruptcy, insolvency, or similar proceeding is pending or, to Guarantor's knowledge, threatened against Guarantor;</w:t>
+      </w:r>
+    </w:p>
+    <w:p>
+      <w:pPr>
+        <w:spacing w:after="160" w:line="276"/>
+        <w:ind w:left="720"/>
+        <w:jc w:val="both"/>
+      </w:pPr>
+      <w:r>
+        <w:rPr>
+          <w:rFonts w:ascii="Times New Roman" w:cs="Times New Roman" w:eastAsia="Times New Roman" w:hAnsi="Times New Roman"/>
+          <w:sz w:val="22"/>
+          <w:szCs w:val="22"/>
+        </w:rPr>
+        <w:t xml:space="preserve">(d) </w:t>
+      </w:r>
+      <w:r>
+        <w:rPr>
+          <w:rFonts w:ascii="Times New Roman" w:cs="Times New Roman" w:eastAsia="Times New Roman" w:hAnsi="Times New Roman"/>
+          <w:sz w:val="22"/>
+          <w:szCs w:val="22"/>
+        </w:rPr>
+        <w:t xml:space="preserve">there is no action, suit, proceeding, or investigation pending or, to either Obligor's knowledge, threatened against either Obligor that could reasonably be expected to impair such Obligor's ability to perform under this Agreement; and</w:t>
+      </w:r>
+    </w:p>
+    <w:p>
+      <w:pPr>
+        <w:spacing w:after="160" w:line="276"/>
+        <w:ind w:left="720"/>
+        <w:jc w:val="both"/>
+      </w:pPr>
+      <w:r>
+        <w:rPr>
+          <w:rFonts w:ascii="Times New Roman" w:cs="Times New Roman" w:eastAsia="Times New Roman" w:hAnsi="Times New Roman"/>
+          <w:sz w:val="22"/>
+          <w:szCs w:val="22"/>
+        </w:rPr>
         <w:t xml:space="preserve">(e) </w:t>
       </w:r>
       <w:r>
@@ -1503,53 +1865,7 @@
           <w:sz w:val="22"/>
           <w:szCs w:val="22"/>
         </w:rPr>
-        <w:t xml:space="preserve">there is no action, suit, proceeding, or investigation pending or, to Borrower's knowledge, threatened against Borrower that could reasonably be expected to impair Borrower's ability to perform the Obligations;</w:t>
-      </w:r>
-    </w:p>
-    <w:p>
-      <w:pPr>
-        <w:spacing w:after="160" w:line="276"/>
-        <w:ind w:left="720"/>
-        <w:jc w:val="both"/>
-      </w:pPr>
-      <w:r>
-        <w:rPr>
-          <w:rFonts w:ascii="Times New Roman" w:cs="Times New Roman" w:eastAsia="Times New Roman" w:hAnsi="Times New Roman"/>
-          <w:sz w:val="22"/>
-          <w:szCs w:val="22"/>
-        </w:rPr>
-        <w:t xml:space="preserve">(f) </w:t>
-      </w:r>
-      <w:r>
-        <w:rPr>
-          <w:rFonts w:ascii="Times New Roman" w:cs="Times New Roman" w:eastAsia="Times New Roman" w:hAnsi="Times New Roman"/>
-          <w:sz w:val="22"/>
-          <w:szCs w:val="22"/>
-        </w:rPr>
-        <w:t xml:space="preserve">all information furnished by Borrower to Lender in connection with the Loan (including the bank account information in Section 1.2 and Borrower's residence address) is true, complete, and correct in all material respects; and</w:t>
-      </w:r>
-    </w:p>
-    <w:p>
-      <w:pPr>
-        <w:spacing w:after="160" w:line="276"/>
-        <w:ind w:left="720"/>
-        <w:jc w:val="both"/>
-      </w:pPr>
-      <w:r>
-        <w:rPr>
-          <w:rFonts w:ascii="Times New Roman" w:cs="Times New Roman" w:eastAsia="Times New Roman" w:hAnsi="Times New Roman"/>
-          <w:sz w:val="22"/>
-          <w:szCs w:val="22"/>
-        </w:rPr>
-        <w:t xml:space="preserve">(g) </w:t>
-      </w:r>
-      <w:r>
-        <w:rPr>
-          <w:rFonts w:ascii="Times New Roman" w:cs="Times New Roman" w:eastAsia="Times New Roman" w:hAnsi="Times New Roman"/>
-          <w:sz w:val="22"/>
-          <w:szCs w:val="22"/>
-        </w:rPr>
-        <w:t xml:space="preserve">the Loan proceeds will not be used for any unlawful purpose.</w:t>
+        <w:t xml:space="preserve">all information furnished by Guarantor to Lender (including Guarantor's residence address) is true, complete, and correct in all material respects.</w:t>
       </w:r>
     </w:p>
     <w:p>
@@ -1567,21 +1883,21 @@
           <w:sz w:val="22"/>
           <w:szCs w:val="22"/>
         </w:rPr>
-        <w:t xml:space="preserve">7. Covenants of Borrower</w:t>
-      </w:r>
-    </w:p>
-    <w:p>
-      <w:pPr>
-        <w:spacing w:after="160" w:line="276"/>
-        <w:jc w:val="both"/>
-      </w:pPr>
-      <w:r>
-        <w:rPr>
-          <w:rFonts w:ascii="Times New Roman" w:cs="Times New Roman" w:eastAsia="Times New Roman" w:hAnsi="Times New Roman"/>
-          <w:sz w:val="22"/>
-          <w:szCs w:val="22"/>
-        </w:rPr>
-        <w:t xml:space="preserve">Until all Obligations are indefeasibly paid and performed in full, Borrower shall:</w:t>
+        <w:t xml:space="preserve">7. Covenants</w:t>
+      </w:r>
+    </w:p>
+    <w:p>
+      <w:pPr>
+        <w:spacing w:after="160" w:line="276"/>
+        <w:jc w:val="both"/>
+      </w:pPr>
+      <w:r>
+        <w:rPr>
+          <w:rFonts w:ascii="Times New Roman" w:cs="Times New Roman" w:eastAsia="Times New Roman" w:hAnsi="Times New Roman"/>
+          <w:sz w:val="22"/>
+          <w:szCs w:val="22"/>
+        </w:rPr>
+        <w:t xml:space="preserve">Until all Obligations are indefeasibly paid and performed in full, each Obligor shall (as applicable to such Obligor):</w:t>
       </w:r>
     </w:p>
     <w:p>
@@ -1627,7 +1943,7 @@
           <w:sz w:val="22"/>
           <w:szCs w:val="22"/>
         </w:rPr>
-        <w:t xml:space="preserve">provide Lender with written notice within five (5) days of any change in Borrower's residence address, legal name, or the deposit account identified in Section 1.2;</w:t>
+        <w:t xml:space="preserve">provide Lender with written notice within five (5) days of any change in Borrower's legal name, state of organization, principal place of business, or the deposit account identified in Section 1.2, or in Guarantor's residence address or legal name;</w:t>
       </w:r>
     </w:p>
     <w:p>
@@ -1650,7 +1966,7 @@
           <w:sz w:val="22"/>
           <w:szCs w:val="22"/>
         </w:rPr>
-        <w:t xml:space="preserve">upon Lender's reasonable request (not more often than quarterly absent an Event of Default), furnish Lender with a current statement of Borrower's assets and liabilities and reasonable supporting documentation;</w:t>
+        <w:t xml:space="preserve">upon Lender's reasonable request (not more often than quarterly absent an Event of Default), furnish Lender with a current statement of such Obligor's assets and liabilities and reasonable supporting documentation;</w:t>
       </w:r>
     </w:p>
     <w:p>
@@ -1673,6 +1989,29 @@
           <w:sz w:val="22"/>
           <w:szCs w:val="22"/>
         </w:rPr>
+        <w:t xml:space="preserve">in the case of Borrower, maintain its corporate existence and good standing and all licenses and permits necessary for the operation of its dental practice;</w:t>
+      </w:r>
+    </w:p>
+    <w:p>
+      <w:pPr>
+        <w:spacing w:after="160" w:line="276"/>
+        <w:ind w:left="720"/>
+        <w:jc w:val="both"/>
+      </w:pPr>
+      <w:r>
+        <w:rPr>
+          <w:rFonts w:ascii="Times New Roman" w:cs="Times New Roman" w:eastAsia="Times New Roman" w:hAnsi="Times New Roman"/>
+          <w:sz w:val="22"/>
+          <w:szCs w:val="22"/>
+        </w:rPr>
+        <w:t xml:space="preserve">(e) </w:t>
+      </w:r>
+      <w:r>
+        <w:rPr>
+          <w:rFonts w:ascii="Times New Roman" w:cs="Times New Roman" w:eastAsia="Times New Roman" w:hAnsi="Times New Roman"/>
+          <w:sz w:val="22"/>
+          <w:szCs w:val="22"/>
+        </w:rPr>
         <w:t xml:space="preserve">promptly notify Lender in writing of the occurrence of any Event of Default or any event that, with notice or lapse of time, would become an Event of Default; and</w:t>
       </w:r>
     </w:p>
@@ -1688,7 +2027,7 @@
           <w:sz w:val="22"/>
           <w:szCs w:val="22"/>
         </w:rPr>
-        <w:t xml:space="preserve">(e) </w:t>
+        <w:t xml:space="preserve">(f) </w:t>
       </w:r>
       <w:r>
         <w:rPr>
@@ -1792,7 +2131,7 @@
           <w:sz w:val="22"/>
           <w:szCs w:val="22"/>
         </w:rPr>
-        <w:t xml:space="preserve">Borrower sells, transfers, or encumbers, or attempts to sell, transfer, or encumber, any Collateral in violation of Section 4.2 (no notice or cure period applying);</w:t>
+        <w:t xml:space="preserve">any Obligor sells, transfers, or encumbers, or attempts to sell, transfer, or encumber, any Collateral in violation of Section 4.2 (no notice or cure period applying);</w:t>
       </w:r>
     </w:p>
     <w:p>
@@ -1815,7 +2154,7 @@
           <w:sz w:val="22"/>
           <w:szCs w:val="22"/>
         </w:rPr>
-        <w:t xml:space="preserve">Borrower breaches any other covenant or obligation under this Agreement and fails to cure such breach within ten (10) days after written notice from Lender;</w:t>
+        <w:t xml:space="preserve">any Obligor breaches any other covenant or obligation under this Agreement and fails to cure such breach within ten (10) days after written notice from Lender;</w:t>
       </w:r>
     </w:p>
     <w:p>
@@ -1838,7 +2177,7 @@
           <w:sz w:val="22"/>
           <w:szCs w:val="22"/>
         </w:rPr>
-        <w:t xml:space="preserve">any representation or warranty made by Borrower herein or in connection herewith proves to have been false or misleading in any material respect when made;</w:t>
+        <w:t xml:space="preserve">any representation or warranty made by any Obligor herein or in connection herewith proves to have been false or misleading in any material respect when made;</w:t>
       </w:r>
     </w:p>
     <w:p>
@@ -1861,7 +2200,7 @@
           <w:sz w:val="22"/>
           <w:szCs w:val="22"/>
         </w:rPr>
-        <w:t xml:space="preserve">Borrower (i) becomes insolvent or generally fails to pay debts as they become due, (ii) makes an assignment for the benefit of creditors, (iii) commences, or has commenced against Borrower, any proceeding under any bankruptcy, insolvency, or debtor-relief law that, in the case of an involuntary proceeding, is not dismissed within sixty (60) days, or (iv) has a receiver, trustee, or custodian appointed for Borrower or any material portion of Borrower's assets;</w:t>
+        <w:t xml:space="preserve">any Obligor (i) becomes insolvent or generally fails to pay debts as they become due, (ii) makes an assignment for the benefit of creditors, (iii) commences, or has commenced against it or him, any proceeding under any bankruptcy, insolvency, or debtor-relief law that, in the case of an involuntary proceeding, is not dismissed within sixty (60) days, or (iv) has a receiver, trustee, or custodian appointed for it or him or any material portion of its or his assets;</w:t>
       </w:r>
     </w:p>
     <w:p>
@@ -1884,7 +2223,7 @@
           <w:sz w:val="22"/>
           <w:szCs w:val="22"/>
         </w:rPr>
-        <w:t xml:space="preserve">any attachment, levy, garnishment, execution, or judicial seizure is made upon any Collateral or any material portion of Borrower's assets and is not released within thirty (30) days;</w:t>
+        <w:t xml:space="preserve">any attachment, levy, garnishment, execution, or judicial seizure is made upon any Collateral or any material portion of any Obligor's assets and is not released within thirty (30) days;</w:t>
       </w:r>
     </w:p>
     <w:p>
@@ -1907,7 +2246,7 @@
           <w:sz w:val="22"/>
           <w:szCs w:val="22"/>
         </w:rPr>
-        <w:t xml:space="preserve">Borrower dies or is judicially declared incompetent (in which case the Obligations shall be enforceable against Borrower's estate); or</w:t>
+        <w:t xml:space="preserve">Borrower dissolves, suspends, or ceases the operation of its business, or loses any license necessary to operate its dental practice;</w:t>
       </w:r>
     </w:p>
     <w:p>
@@ -1930,7 +2269,30 @@
           <w:sz w:val="22"/>
           <w:szCs w:val="22"/>
         </w:rPr>
-        <w:t xml:space="preserve">any material adverse change occurs in Borrower's financial condition that, in Lender's reasonable judgment, impairs the prospect of payment or performance of the Obligations.</w:t>
+        <w:t xml:space="preserve">Guarantor dies or is judicially declared incompetent (in which case the Guaranteed Obligations shall be enforceable against Guarantor's estate), or Guarantor attempts to revoke the guaranty in Article 5, or Guarantor ceases to own and control Borrower without Lender's prior written consent; or</w:t>
+      </w:r>
+    </w:p>
+    <w:p>
+      <w:pPr>
+        <w:spacing w:after="160" w:line="276"/>
+        <w:ind w:left="720"/>
+        <w:jc w:val="both"/>
+      </w:pPr>
+      <w:r>
+        <w:rPr>
+          <w:rFonts w:ascii="Times New Roman" w:cs="Times New Roman" w:eastAsia="Times New Roman" w:hAnsi="Times New Roman"/>
+          <w:sz w:val="22"/>
+          <w:szCs w:val="22"/>
+        </w:rPr>
+        <w:t xml:space="preserve">(i) </w:t>
+      </w:r>
+      <w:r>
+        <w:rPr>
+          <w:rFonts w:ascii="Times New Roman" w:cs="Times New Roman" w:eastAsia="Times New Roman" w:hAnsi="Times New Roman"/>
+          <w:sz w:val="22"/>
+          <w:szCs w:val="22"/>
+        </w:rPr>
+        <w:t xml:space="preserve">any material adverse change occurs in the financial condition of any Obligor that, in Lender's reasonable judgment, impairs the prospect of payment or performance of the Obligations.</w:t>
       </w:r>
     </w:p>
     <w:p>
@@ -2018,7 +2380,7 @@
           <w:sz w:val="22"/>
           <w:szCs w:val="22"/>
         </w:rPr>
-        <w:t xml:space="preserve">Upon any Event of Default, Lender shall have all rights and remedies of a secured party under the UCC and applicable law, including the right to take possession of, collect, and dispose of the Collateral in any commercially reasonable manner. Borrower shall, upon Lender's demand, assemble the Collateral and make it available to Lender at a place reasonably designated by Lender. Ten (10) days' prior written notice of any disposition of Collateral shall constitute commercially reasonable notice.</w:t>
+        <w:t xml:space="preserve">Upon any Event of Default, Lender shall have all rights and remedies of a secured party under the UCC and applicable law with respect to each Obligor's Collateral, including the right to take possession of, collect, and dispose of the Collateral in any commercially reasonable manner. Each Obligor shall, upon Lender's demand, assemble such Obligor's Collateral and make it available to Lender at a place reasonably designated by Lender. Ten (10) days' prior written notice of any disposition of Collateral shall constitute commercially reasonable notice.</w:t>
       </w:r>
     </w:p>
     <w:p>
@@ -2053,7 +2415,7 @@
           <w:sz w:val="22"/>
           <w:szCs w:val="22"/>
         </w:rPr>
-        <w:t xml:space="preserve">Borrower shall pay on demand all costs and expenses incurred by Lender in connection with the enforcement of this Agreement and the collection of the Obligations, including reasonable attorneys' fees and costs, arbitration fees and costs, collection agency fees, expert fees, and costs of repossession, storage, preparation, and disposition of Collateral, all of which shall be added to and constitute Obligations secured hereunder.</w:t>
+        <w:t xml:space="preserve">The Obligors shall, jointly and severally, pay on demand all costs and expenses incurred by Lender in connection with the enforcement of this Agreement and the collection of the Obligations, including reasonable attorneys' fees and costs, arbitration fees and costs, collection agency fees, expert fees, and costs of repossession, storage, preparation, and disposition of Collateral, all of which shall be added to and constitute Obligations secured hereunder.</w:t>
       </w:r>
     </w:p>
     <w:p>
@@ -2088,7 +2450,7 @@
           <w:sz w:val="22"/>
           <w:szCs w:val="22"/>
         </w:rPr>
-        <w:t xml:space="preserve">All rights and remedies of Lender under this Agreement and applicable law are cumulative and not exclusive, and may be exercised singly, concurrently, or successively. No delay or failure by Lender to exercise any right or remedy shall operate as a waiver thereof.</w:t>
+        <w:t xml:space="preserve">All rights and remedies of Lender under this Agreement and applicable law are cumulative and not exclusive, and may be exercised singly, concurrently, or successively, against either or both Obligors. No delay or failure by Lender to exercise any right or remedy shall operate as a waiver thereof.</w:t>
       </w:r>
     </w:p>
     <w:p>
@@ -2141,7 +2503,7 @@
           <w:sz w:val="22"/>
           <w:szCs w:val="22"/>
         </w:rPr>
-        <w:t xml:space="preserve">Except as provided in Section 10.3, any and all disputes, claims, or controversies arising out of or relating to this Agreement, the Loan, the Collateral, or the breach, termination, enforcement, interpretation, or validity thereof (each, a </w:t>
+        <w:t xml:space="preserve">Except as provided in Section 10.3, any and all disputes, claims, or controversies arising out of or relating to this Agreement, the Loan, the guaranty, the Collateral, or the breach, termination, enforcement, interpretation, or validity thereof (each, a </w:t>
       </w:r>
       <w:r>
         <w:rPr>
@@ -2229,7 +2591,7 @@
           <w:sz w:val="22"/>
           <w:szCs w:val="22"/>
         </w:rPr>
-        <w:t xml:space="preserve">Notwithstanding Section 10.1, Lender may, without waiving arbitration as to any other Dispute: (a) exercise self-help and non-judicial remedies with respect to the Collateral, including repossession and disposition under the UCC; (b) seek provisional or ancillary remedies from any court of competent jurisdiction, including writs of attachment or possession, claim and delivery, injunctive relief, and appointment of a receiver; (c) file and enforce UCC financing statements and other perfection actions; and (d) bring an action in small claims court for Disputes within that court's jurisdiction. The exercise of any such right shall not constitute a waiver of the right to compel arbitration.</w:t>
+        <w:t xml:space="preserve">Notwithstanding Section 10.1, Lender may, without waiving arbitration as to any other Dispute: (a) exercise self-help and non-judicial remedies with respect to any Collateral, including repossession and disposition under the UCC; (b) seek provisional or ancillary remedies from any court of competent jurisdiction, including writs of attachment or possession, claim and delivery, injunctive relief, and appointment of a receiver; (c) file and enforce UCC financing statements and other perfection actions; and (d) bring an action in small claims court for Disputes within that court's jurisdiction. The exercise of any such right shall not constitute a waiver of the right to compel arbitration.</w:t>
       </w:r>
     </w:p>
     <w:p>
@@ -2387,7 +2749,7 @@
           <w:sz w:val="22"/>
           <w:szCs w:val="22"/>
         </w:rPr>
-        <w:t xml:space="preserve">In any Dispute between the Parties arising out of or relating to this Agreement, the prevailing Party shall be entitled to recover its reasonable attorneys' fees and costs, in addition to any other relief awarded.</w:t>
+        <w:t xml:space="preserve">In any Dispute between or among the Parties arising out of or relating to this Agreement, the prevailing Party shall be entitled to recover its reasonable attorneys' fees and costs, in addition to any other relief awarded.</w:t>
       </w:r>
     </w:p>
     <w:p>
@@ -2422,7 +2784,7 @@
           <w:sz w:val="22"/>
           <w:szCs w:val="22"/>
         </w:rPr>
-        <w:t xml:space="preserve">Lender may assign, sell, or transfer this Agreement and the Obligations, in whole or in part, without Borrower's consent. Borrower may not assign or delegate any rights or obligations under this Agreement without Lender's prior written consent, and any purported assignment in violation hereof is void. This Agreement binds and benefits the Parties and their respective heirs, executors, administrators, successors, and permitted assigns.</w:t>
+        <w:t xml:space="preserve">Lender may assign, sell, or transfer this Agreement and the Obligations, in whole or in part, without the consent of any Obligor. No Obligor may assign or delegate any rights or obligations under this Agreement without Lender's prior written consent, and any purported assignment in violation hereof is void. This Agreement binds and benefits the Parties and their respective heirs, executors, administrators, successors, and permitted assigns.</w:t>
       </w:r>
     </w:p>
     <w:p>
@@ -2492,7 +2854,7 @@
           <w:sz w:val="22"/>
           <w:szCs w:val="22"/>
         </w:rPr>
-        <w:t xml:space="preserve">No waiver of any provision of this Agreement shall be effective unless in a writing signed by the waiving Party, and no waiver shall constitute a waiver of any other or subsequent breach. This Agreement may be amended only by a written instrument signed by both Parties.</w:t>
+        <w:t xml:space="preserve">No waiver of any provision of this Agreement shall be effective unless in a writing signed by the waiving Party, and no waiver shall constitute a waiver of any other or subsequent breach. This Agreement may be amended only by a written instrument signed by all Parties.</w:t>
       </w:r>
     </w:p>
     <w:p>
@@ -2527,7 +2889,7 @@
           <w:sz w:val="22"/>
           <w:szCs w:val="22"/>
         </w:rPr>
-        <w:t xml:space="preserve">This Agreement, together with its exhibits, constitutes the entire agreement between the Parties with respect to its subject matter and supersedes all prior and contemporaneous agreements, understandings, negotiations, and discussions, whether oral or written.</w:t>
+        <w:t xml:space="preserve">This Agreement, together with its exhibits, constitutes the entire agreement among the Parties with respect to its subject matter and supersedes all prior and contemporaneous agreements, understandings, negotiations, and discussions, whether oral or written.</w:t>
       </w:r>
     </w:p>
     <w:p>
@@ -2597,7 +2959,7 @@
           <w:sz w:val="22"/>
           <w:szCs w:val="22"/>
         </w:rPr>
-        <w:t xml:space="preserve">Time is of the essence with respect to every provision of this Agreement. The Parties have each had the opportunity to consult independent legal counsel of their choosing, and this Agreement shall be construed as if drafted jointly, without presumption against either Party. Headings are for convenience only and do not affect interpretation.</w:t>
+        <w:t xml:space="preserve">Time is of the essence with respect to every provision of this Agreement. The Parties have each had the opportunity to consult independent legal counsel of their choosing, and this Agreement shall be construed as if drafted jointly, without presumption against any Party. Headings are for convenience only and do not affect interpretation.</w:t>
       </w:r>
     </w:p>
     <w:p>
@@ -2809,6 +3171,22 @@
     </w:p>
     <w:p>
       <w:pPr>
+        <w:spacing w:after="60"/>
+        <w:jc w:val="both"/>
+      </w:pPr>
+      <w:r>
+        <w:rPr>
+          <w:rFonts w:ascii="Times New Roman" w:cs="Times New Roman" w:eastAsia="Times New Roman" w:hAnsi="Times New Roman"/>
+          <w:b/>
+          <w:bCs/>
+          <w:sz w:val="22"/>
+          <w:szCs w:val="22"/>
+        </w:rPr>
+        <w:t xml:space="preserve">BORROWER:</w:t>
+      </w:r>
+    </w:p>
+    <w:p>
+      <w:pPr>
         <w:spacing w:after="240"/>
         <w:jc w:val="both"/>
       </w:pPr>
@@ -2820,7 +3198,113 @@
           <w:sz w:val="22"/>
           <w:szCs w:val="22"/>
         </w:rPr>
-        <w:t xml:space="preserve">BORROWER (individually, and as grantor of the security interest and guarantor of the Obligations):</w:t>
+        <w:t xml:space="preserve">JONATHAN R. BLINSTRUB, DDS INC., a California professional corporation</w:t>
+      </w:r>
+    </w:p>
+    <w:p>
+      <w:pPr>
+        <w:tabs>
+          <w:tab w:val="left" w:pos="4680"/>
+        </w:tabs>
+        <w:spacing w:after="40" w:before="60"/>
+      </w:pPr>
+      <w:r>
+        <w:rPr>
+          <w:rFonts w:ascii="Times New Roman" w:cs="Times New Roman" w:eastAsia="Times New Roman" w:hAnsi="Times New Roman"/>
+          <w:sz w:val="22"/>
+          <w:szCs w:val="22"/>
+        </w:rPr>
+        <w:t xml:space="preserve">By: _________________________________</w:t>
+      </w:r>
+    </w:p>
+    <w:p>
+      <w:pPr>
+        <w:tabs>
+          <w:tab w:val="left" w:pos="4680"/>
+        </w:tabs>
+        <w:spacing w:after="40" w:before="60"/>
+      </w:pPr>
+      <w:r>
+        <w:rPr>
+          <w:rFonts w:ascii="Times New Roman" w:cs="Times New Roman" w:eastAsia="Times New Roman" w:hAnsi="Times New Roman"/>
+          <w:sz w:val="22"/>
+          <w:szCs w:val="22"/>
+        </w:rPr>
+        <w:t xml:space="preserve">Name: Jonathan Blinstrub</w:t>
+      </w:r>
+    </w:p>
+    <w:p>
+      <w:pPr>
+        <w:tabs>
+          <w:tab w:val="left" w:pos="4680"/>
+        </w:tabs>
+        <w:spacing w:after="40" w:before="60"/>
+      </w:pPr>
+      <w:r>
+        <w:rPr>
+          <w:rFonts w:ascii="Times New Roman" w:cs="Times New Roman" w:eastAsia="Times New Roman" w:hAnsi="Times New Roman"/>
+          <w:sz w:val="22"/>
+          <w:szCs w:val="22"/>
+        </w:rPr>
+        <w:t xml:space="preserve">Title: President</w:t>
+      </w:r>
+    </w:p>
+    <w:p>
+      <w:pPr>
+        <w:tabs>
+          <w:tab w:val="left" w:pos="4680"/>
+        </w:tabs>
+        <w:spacing w:after="40" w:before="60"/>
+      </w:pPr>
+      <w:r>
+        <w:rPr>
+          <w:rFonts w:ascii="Times New Roman" w:cs="Times New Roman" w:eastAsia="Times New Roman" w:hAnsi="Times New Roman"/>
+          <w:sz w:val="22"/>
+          <w:szCs w:val="22"/>
+        </w:rPr>
+        <w:t xml:space="preserve">Date: _______________________________</w:t>
+      </w:r>
+    </w:p>
+    <w:p>
+      <w:pPr>
+        <w:spacing w:after="80"/>
+      </w:pPr>
+      <w:r>
+        <w:rPr>
+          <w:rFonts w:ascii="Times New Roman" w:cs="Times New Roman" w:eastAsia="Times New Roman" w:hAnsi="Times New Roman"/>
+          <w:sz w:val="22"/>
+          <w:szCs w:val="22"/>
+        </w:rPr>
+        <w:t xml:space="preserve"/>
+      </w:r>
+    </w:p>
+    <w:p>
+      <w:pPr>
+        <w:spacing w:after="80"/>
+      </w:pPr>
+      <w:r>
+        <w:rPr>
+          <w:rFonts w:ascii="Times New Roman" w:cs="Times New Roman" w:eastAsia="Times New Roman" w:hAnsi="Times New Roman"/>
+          <w:sz w:val="22"/>
+          <w:szCs w:val="22"/>
+        </w:rPr>
+        <w:t xml:space="preserve"/>
+      </w:r>
+    </w:p>
+    <w:p>
+      <w:pPr>
+        <w:spacing w:after="240"/>
+        <w:jc w:val="both"/>
+      </w:pPr>
+      <w:r>
+        <w:rPr>
+          <w:rFonts w:ascii="Times New Roman" w:cs="Times New Roman" w:eastAsia="Times New Roman" w:hAnsi="Times New Roman"/>
+          <w:b/>
+          <w:bCs/>
+          <w:sz w:val="22"/>
+          <w:szCs w:val="22"/>
+        </w:rPr>
+        <w:t xml:space="preserve">GUARANTOR (individually, as guarantor of the Guaranteed Obligations and grantor of a security interest in Guarantor's Collateral):</w:t>
       </w:r>
     </w:p>
     <w:p>

</xml_diff>